<commit_message>
changes for the IRB
</commit_message>
<xml_diff>
--- a/irb_submission/SORA_Data_Collection_Instrument_v1.0.docx
+++ b/irb_submission/SORA_Data_Collection_Instrument_v1.0.docx
@@ -11,7 +11,7 @@
         <w:rPr>
           <w:b/>
         </w:rPr>
-        <w:t>SORA Clinic Data Collection Form</w:t>
+        <w:t>SORA Electronic Data Collection Template</w:t>
       </w:r>
     </w:p>
     <w:p>
@@ -23,7 +23,12 @@
           <w:i/>
           <w:sz w:val="22"/>
         </w:rPr>
-        <w:t>Protocol Version 1.0 — one row per eligible patient; no exact dates or free text</w:t>
+        <w:t>Protocol Version 1.0 — electronic spreadsheet submission; one row per eligible patient</w:t>
+      </w:r>
+    </w:p>
+    <w:p>
+      <w:r>
+        <w:t>Submission method: Enter data in the study-provided Excel workbook or equivalent CSV file and upload through the approved secure portal. Do not use paper, scanned, photographed, faxed, email-body, or handwritten submissions.</w:t>
       </w:r>
     </w:p>
     <w:p>

</xml_diff>